<commit_message>
Toan 12 T21-25: sua cong thuc mat dau tru/phep toan trong ngoac; slide On tap Cau 9; sua loi giai cau 4 bai cung co Bai 4
Co-Authored-By: Claude Opus 5.5 <noreply@anthropic.com>
</commit_message>
<xml_diff>
--- a/mon/toan/khbd/lop12/KHBD_TOAN12_BaiTapCuoiChuong1_T23-24.docx
+++ b/mon/toan/khbd/lop12/KHBD_TOAN12_BaiTapCuoiChuong1_T23-24.docx
@@ -2257,14 +2257,15 @@
       <m:oMath>
         <m:d>
           <m:dPr>
-            <m:sepChr m:val="≠"/>
+            <m:sepChr m:val=""/>
           </m:dPr>
           <m:e>
             <m:r>
               <m:t>a</m:t>
             </m:r>
-          </m:e>
-          <m:e>
+            <m:r>
+              <m:t>≠</m:t>
+            </m:r>
             <m:r>
               <m:t>0</m:t>
             </m:r>
@@ -6129,18 +6130,21 @@
       <m:oMath>
         <m:d>
           <m:dPr>
-            <m:sepChr m:val="−"/>
+            <m:sepChr m:val=""/>
           </m:dPr>
-          <m:e/>
           <m:e>
             <m:r>
+              <m:t>−</m:t>
+            </m:r>
+            <m:r>
               <m:t>2</m:t>
             </m:r>
             <m:r>
               <m:t>;</m:t>
             </m:r>
-          </m:e>
-          <m:e>
+            <m:r>
+              <m:t>−</m:t>
+            </m:r>
             <m:r>
               <m:t>3</m:t>
             </m:r>
@@ -6977,10 +6981,12 @@
       <m:oMath>
         <m:d>
           <m:dPr>
-            <m:sepChr m:val="−"/>
+            <m:sepChr m:val=""/>
           </m:dPr>
-          <m:e/>
           <m:e>
+            <m:r>
+              <m:t>−</m:t>
+            </m:r>
             <m:r>
               <m:t>1</m:t>
             </m:r>
@@ -7120,11 +7126,13 @@
         <m:d>
           <m:dPr>
             <m:begChr m:val="{"/>
-            <m:sepChr m:val="−"/>
+            <m:sepChr m:val=""/>
             <m:endChr m:val="}"/>
           </m:dPr>
-          <m:e/>
           <m:e>
+            <m:r>
+              <m:t>−</m:t>
+            </m:r>
             <m:f>
               <m:fPr>
                 <m:type m:val="bar"/>
@@ -7499,18 +7507,21 @@
       <m:oMath>
         <m:d>
           <m:dPr>
-            <m:sepChr m:val="−"/>
+            <m:sepChr m:val=""/>
           </m:dPr>
-          <m:e/>
           <m:e>
             <m:r>
+              <m:t>−</m:t>
+            </m:r>
+            <m:r>
               <m:t>2</m:t>
             </m:r>
             <m:r>
               <m:t>;</m:t>
             </m:r>
-          </m:e>
-          <m:e>
+            <m:r>
+              <m:t>−</m:t>
+            </m:r>
             <m:r>
               <m:t>1</m:t>
             </m:r>
@@ -7527,10 +7538,12 @@
       <m:oMath>
         <m:d>
           <m:dPr>
-            <m:sepChr m:val="−"/>
+            <m:sepChr m:val=""/>
           </m:dPr>
-          <m:e/>
           <m:e>
+            <m:r>
+              <m:t>−</m:t>
+            </m:r>
             <m:r>
               <m:t>1</m:t>
             </m:r>
@@ -7843,11 +7856,13 @@
         <m:d>
           <m:dPr>
             <m:begChr m:val="["/>
-            <m:sepChr m:val="−"/>
+            <m:sepChr m:val=""/>
             <m:endChr m:val="]"/>
           </m:dPr>
-          <m:e/>
           <m:e>
+            <m:r>
+              <m:t>−</m:t>
+            </m:r>
             <m:rad>
               <m:radPr>
                 <m:degHide m:val="on"/>
@@ -9064,7 +9079,7 @@
       <m:oMath>
         <m:d>
           <m:dPr>
-            <m:sepChr m:val="−"/>
+            <m:sepChr m:val=""/>
           </m:dPr>
           <m:e>
             <m:r>
@@ -9073,8 +9088,9 @@
             <m:r>
               <m:t>;</m:t>
             </m:r>
-          </m:e>
-          <m:e>
+            <m:r>
+              <m:t>−</m:t>
+            </m:r>
             <m:r>
               <m:t>1</m:t>
             </m:r>
@@ -9090,7 +9106,13 @@
       </w:r>
       <m:oMath>
         <m:r>
-          <m:t>I(−1;2)</m:t>
+          <m:t>I(</m:t>
+        </m:r>
+        <m:r>
+          <m:t>−</m:t>
+        </m:r>
+        <m:r>
+          <m:t>1;2)</m:t>
         </m:r>
       </m:oMath>
       <w:r>
@@ -18003,7 +18025,7 @@
         </m:r>
         <m:d>
           <m:dPr>
-            <m:sepChr m:val="+"/>
+            <m:sepChr m:val=""/>
           </m:dPr>
           <m:e>
             <m:f>
@@ -18021,8 +18043,9 @@
                 </m:r>
               </m:den>
             </m:f>
-          </m:e>
-          <m:e>
+            <m:r>
+              <m:t>+</m:t>
+            </m:r>
             <m:f>
               <m:fPr>
                 <m:type m:val="bar"/>

</xml_diff>